<commit_message>
Align business plan with original outline and individual service headings
</commit_message>
<xml_diff>
--- a/documents/Businessplan_Dr_Mahsa_Motlagh_2026-10-27.docx
+++ b/documents/Businessplan_Dr_Mahsa_Motlagh_2026-10-27.docx
@@ -51,18 +51,6 @@
       </w:pPr>
       <w:r>
         <w:t>Stand: 27. Oktober 2026 · Version 1.0</w:t>
-      </w:r>
-    </w:p>
-    <w:p>
-      <w:pPr>
-        <w:pStyle w:val="berschrift2"/>
-        <w:numPr>
-          <w:numId w:val="0"/>
-        </w:numPr>
-        <w:spacing w:before="200" w:after="100"/>
-      </w:pPr>
-      <w:r>
-        <w:t>Gründungsdaten im Überblick</w:t>
       </w:r>
     </w:p>
     <w:tbl>
@@ -406,51 +394,494 @@
         <w:spacing w:before="200" w:after="100"/>
       </w:pPr>
       <w:r>
-        <w:t>Executive Summary</w:t>
-      </w:r>
-    </w:p>
-    <w:p>
-      <w:pPr>
-        <w:spacing w:after="100" w:line="252" w:lineRule="auto"/>
-      </w:pPr>
-      <w:r>
-        <w:t>Dr. Mahsa Motlagh plant den Aufbau einer forschungsbasierten Beratung für partizipative Zukunftsgestaltung und Transformation. Sie unterstützt Projekt- und Programmverantwortliche, deren Arbeit von Stakeholder-Zusammenarbeit, zukunftsgerichteten Entscheidungen und der Übersetzung komplexen Wissens in praktisches Handeln abhängt.</w:t>
-      </w:r>
-    </w:p>
-    <w:p>
-      <w:pPr>
-        <w:spacing w:after="100" w:line="252" w:lineRule="auto"/>
-      </w:pPr>
-      <w:r>
-        <w:t>Die Beratung verbindet drei Leistungen: Futures and Transformation Advisory, Participatory Lab and Experience Delivery sowie Capability Building and Method Transfer. Kunden können abgegrenzte Analyse- und Beratungsprojekte, vollständig organisierte Labs, längerfristige Kompetenzprogramme oder zeitlich begrenzte eingebettete Mandate beauftragen.</w:t>
-      </w:r>
-    </w:p>
-    <w:p>
-      <w:pPr>
-        <w:spacing w:after="100" w:line="252" w:lineRule="auto"/>
-      </w:pPr>
-      <w:r>
-        <w:t>Die Gründerin bringt eine Promotion in Governance und Sozioökonomie natürlicher Ressourcen sowie Erfahrung in Forschung, internationaler Beratung, partizipativen Methoden, Serious Games, Weiterbildung und Projektkoordination mit. Der Markteintritt konzentriert sich auf Hochschulen, Forschungsverbünde, öffentliche Einrichtungen und NGOs. Unternehmen mit entsprechendem Transformationsbedarf bilden eine ergänzende Zielgruppe.</w:t>
-      </w:r>
-    </w:p>
-    <w:p>
-      <w:pPr>
-        <w:spacing w:after="100" w:line="252" w:lineRule="auto"/>
-      </w:pPr>
-      <w:r>
-        <w:t>Der Aufbau erfolgt zunächst als personengeführte Beratung ohne angestelltes Personal. Leistungen werden remote, hybrid und vor Ort erbracht. Kooperationen werden projektbezogen eingesetzt. Standardisierte Toolkits, professionelle Trainingsprogramme und lizenzierte Ressourcen sind spätere Entwicklungsoptionen; daraus werden in der Basisplanung keine Umsätze angesetzt.</w:t>
-      </w:r>
-    </w:p>
-    <w:p>
-      <w:pPr>
-        <w:pStyle w:val="berschrift2"/>
+        <w:t>Inhaltsverzeichnis</w:t>
+      </w:r>
+    </w:p>
+    <w:p>
+      <w:pPr>
+        <w:tabs>
+          <w:tab w:pos="8901" w:val="right"/>
+        </w:tabs>
+        <w:spacing w:after="80" w:line="240" w:lineRule="auto"/>
+        <w:ind w:left="0"/>
+      </w:pPr>
+      <w:r>
+        <w:rPr>
+          <w:sz w:val="20"/>
+        </w:rPr>
+        <w:t>1. Executive Summary</w:t>
+        <w:tab/>
+        <w:t>3</w:t>
+      </w:r>
+    </w:p>
+    <w:p>
+      <w:pPr>
+        <w:tabs>
+          <w:tab w:pos="8901" w:val="right"/>
+        </w:tabs>
+        <w:spacing w:after="80" w:line="240" w:lineRule="auto"/>
+        <w:ind w:left="0"/>
+      </w:pPr>
+      <w:r>
+        <w:rPr>
+          <w:sz w:val="20"/>
+        </w:rPr>
+        <w:t>2. Dienstleistung</w:t>
+        <w:tab/>
+        <w:t>4</w:t>
+      </w:r>
+    </w:p>
+    <w:p>
+      <w:pPr>
+        <w:tabs>
+          <w:tab w:pos="8646" w:val="right"/>
+        </w:tabs>
+        <w:spacing w:after="80" w:line="240" w:lineRule="auto"/>
+        <w:ind w:left="255"/>
+      </w:pPr>
+      <w:r>
+        <w:rPr>
+          <w:sz w:val="20"/>
+        </w:rPr>
+        <w:t>2.1. Angebote</w:t>
+        <w:tab/>
+        <w:t>4</w:t>
+      </w:r>
+    </w:p>
+    <w:p>
+      <w:pPr>
+        <w:tabs>
+          <w:tab w:pos="8391" w:val="right"/>
+        </w:tabs>
+        <w:spacing w:after="80" w:line="240" w:lineRule="auto"/>
+        <w:ind w:left="510"/>
+      </w:pPr>
+      <w:r>
+        <w:rPr>
+          <w:sz w:val="20"/>
+        </w:rPr>
+        <w:t>2.1.1. Futures and Transformation Advisory</w:t>
+        <w:tab/>
+        <w:t>4</w:t>
+      </w:r>
+    </w:p>
+    <w:p>
+      <w:pPr>
+        <w:tabs>
+          <w:tab w:pos="8391" w:val="right"/>
+        </w:tabs>
+        <w:spacing w:after="80" w:line="240" w:lineRule="auto"/>
+        <w:ind w:left="510"/>
+      </w:pPr>
+      <w:r>
+        <w:rPr>
+          <w:sz w:val="20"/>
+        </w:rPr>
+        <w:t>2.1.2. Participatory Lab and Experience Delivery</w:t>
+        <w:tab/>
+        <w:t>4</w:t>
+      </w:r>
+    </w:p>
+    <w:p>
+      <w:pPr>
+        <w:tabs>
+          <w:tab w:pos="8391" w:val="right"/>
+        </w:tabs>
+        <w:spacing w:after="80" w:line="240" w:lineRule="auto"/>
+        <w:ind w:left="510"/>
+      </w:pPr>
+      <w:r>
+        <w:rPr>
+          <w:sz w:val="20"/>
+        </w:rPr>
+        <w:t>2.1.3. Capability Building and Method Transfer</w:t>
+        <w:tab/>
+        <w:t>4</w:t>
+      </w:r>
+    </w:p>
+    <w:p>
+      <w:pPr>
+        <w:tabs>
+          <w:tab w:pos="8646" w:val="right"/>
+        </w:tabs>
+        <w:spacing w:after="80" w:line="240" w:lineRule="auto"/>
+        <w:ind w:left="255"/>
+      </w:pPr>
+      <w:r>
+        <w:rPr>
+          <w:sz w:val="20"/>
+        </w:rPr>
+        <w:t>2.2. Kundennutzen</w:t>
+        <w:tab/>
+        <w:t>4</w:t>
+      </w:r>
+    </w:p>
+    <w:p>
+      <w:pPr>
+        <w:tabs>
+          <w:tab w:pos="8646" w:val="right"/>
+        </w:tabs>
+        <w:spacing w:after="80" w:line="240" w:lineRule="auto"/>
+        <w:ind w:left="255"/>
+      </w:pPr>
+      <w:r>
+        <w:rPr>
+          <w:sz w:val="20"/>
+        </w:rPr>
+        <w:t>2.3. Zielgruppe</w:t>
+        <w:tab/>
+        <w:t>5</w:t>
+      </w:r>
+    </w:p>
+    <w:p>
+      <w:pPr>
+        <w:tabs>
+          <w:tab w:pos="8646" w:val="right"/>
+        </w:tabs>
+        <w:spacing w:after="80" w:line="240" w:lineRule="auto"/>
+        <w:ind w:left="255"/>
+      </w:pPr>
+      <w:r>
+        <w:rPr>
+          <w:sz w:val="20"/>
+        </w:rPr>
+        <w:t>2.4. Alleinstellungsmerkmal</w:t>
+        <w:tab/>
+        <w:t>5</w:t>
+      </w:r>
+    </w:p>
+    <w:p>
+      <w:pPr>
+        <w:tabs>
+          <w:tab w:pos="8646" w:val="right"/>
+        </w:tabs>
+        <w:spacing w:after="80" w:line="240" w:lineRule="auto"/>
+        <w:ind w:left="255"/>
+      </w:pPr>
+      <w:r>
+        <w:rPr>
+          <w:sz w:val="20"/>
+        </w:rPr>
+        <w:t>2.5. Genehmigungen/Zulassungen</w:t>
+        <w:tab/>
+        <w:t>5</w:t>
+      </w:r>
+    </w:p>
+    <w:p>
+      <w:pPr>
+        <w:tabs>
+          <w:tab w:pos="8901" w:val="right"/>
+        </w:tabs>
+        <w:spacing w:after="80" w:line="240" w:lineRule="auto"/>
+        <w:ind w:left="0"/>
+      </w:pPr>
+      <w:r>
+        <w:rPr>
+          <w:sz w:val="20"/>
+        </w:rPr>
+        <w:t>3. Gründerperson</w:t>
+        <w:tab/>
+        <w:t>6</w:t>
+      </w:r>
+    </w:p>
+    <w:p>
+      <w:pPr>
+        <w:tabs>
+          <w:tab w:pos="8901" w:val="right"/>
+        </w:tabs>
+        <w:spacing w:after="80" w:line="240" w:lineRule="auto"/>
+        <w:ind w:left="0"/>
+      </w:pPr>
+      <w:r>
+        <w:rPr>
+          <w:sz w:val="20"/>
+        </w:rPr>
+        <w:t>4. Marktanalyse</w:t>
+        <w:tab/>
+        <w:t>7</w:t>
+      </w:r>
+    </w:p>
+    <w:p>
+      <w:pPr>
+        <w:tabs>
+          <w:tab w:pos="8646" w:val="right"/>
+        </w:tabs>
+        <w:spacing w:after="80" w:line="240" w:lineRule="auto"/>
+        <w:ind w:left="255"/>
+      </w:pPr>
+      <w:r>
+        <w:rPr>
+          <w:sz w:val="20"/>
+        </w:rPr>
+        <w:t>4.1. Aktuelle Marktsituation/Trends</w:t>
+        <w:tab/>
+        <w:t>7</w:t>
+      </w:r>
+    </w:p>
+    <w:p>
+      <w:pPr>
+        <w:tabs>
+          <w:tab w:pos="8646" w:val="right"/>
+        </w:tabs>
+        <w:spacing w:after="80" w:line="240" w:lineRule="auto"/>
+        <w:ind w:left="255"/>
+      </w:pPr>
+      <w:r>
+        <w:rPr>
+          <w:sz w:val="20"/>
+        </w:rPr>
+        <w:t>4.2. Wettbewerbsanalyse</w:t>
+        <w:tab/>
+        <w:t>7</w:t>
+      </w:r>
+    </w:p>
+    <w:p>
+      <w:pPr>
+        <w:tabs>
+          <w:tab w:pos="8646" w:val="right"/>
+        </w:tabs>
+        <w:spacing w:after="80" w:line="240" w:lineRule="auto"/>
+        <w:ind w:left="255"/>
+      </w:pPr>
+      <w:r>
+        <w:rPr>
+          <w:sz w:val="20"/>
+        </w:rPr>
+        <w:t>4.3. Zielgruppenanalyse</w:t>
+        <w:tab/>
+        <w:t>7</w:t>
+      </w:r>
+    </w:p>
+    <w:p>
+      <w:pPr>
+        <w:tabs>
+          <w:tab w:pos="8646" w:val="right"/>
+        </w:tabs>
+        <w:spacing w:after="80" w:line="240" w:lineRule="auto"/>
+        <w:ind w:left="255"/>
+      </w:pPr>
+      <w:r>
+        <w:rPr>
+          <w:sz w:val="20"/>
+        </w:rPr>
+        <w:t>4.4. Einschätzung des eigenen Marktpotenzials</w:t>
+        <w:tab/>
+        <w:t>7</w:t>
+      </w:r>
+    </w:p>
+    <w:p>
+      <w:pPr>
+        <w:tabs>
+          <w:tab w:pos="8901" w:val="right"/>
+        </w:tabs>
+        <w:spacing w:after="80" w:line="240" w:lineRule="auto"/>
+        <w:ind w:left="0"/>
+      </w:pPr>
+      <w:r>
+        <w:rPr>
+          <w:sz w:val="20"/>
+        </w:rPr>
+        <w:t>5. Marketing</w:t>
+        <w:tab/>
+        <w:t>8</w:t>
+      </w:r>
+    </w:p>
+    <w:p>
+      <w:pPr>
+        <w:tabs>
+          <w:tab w:pos="8646" w:val="right"/>
+        </w:tabs>
+        <w:spacing w:after="80" w:line="240" w:lineRule="auto"/>
+        <w:ind w:left="255"/>
+      </w:pPr>
+      <w:r>
+        <w:rPr>
+          <w:sz w:val="20"/>
+        </w:rPr>
+        <w:t>5.1. Produktpolitik</w:t>
+        <w:tab/>
+        <w:t>8</w:t>
+      </w:r>
+    </w:p>
+    <w:p>
+      <w:pPr>
+        <w:tabs>
+          <w:tab w:pos="8646" w:val="right"/>
+        </w:tabs>
+        <w:spacing w:after="80" w:line="240" w:lineRule="auto"/>
+        <w:ind w:left="255"/>
+      </w:pPr>
+      <w:r>
+        <w:rPr>
+          <w:sz w:val="20"/>
+        </w:rPr>
+        <w:t>5.2. Preispolitik</w:t>
+        <w:tab/>
+        <w:t>8</w:t>
+      </w:r>
+    </w:p>
+    <w:p>
+      <w:pPr>
+        <w:tabs>
+          <w:tab w:pos="8646" w:val="right"/>
+        </w:tabs>
+        <w:spacing w:after="80" w:line="240" w:lineRule="auto"/>
+        <w:ind w:left="255"/>
+      </w:pPr>
+      <w:r>
+        <w:rPr>
+          <w:sz w:val="20"/>
+        </w:rPr>
+        <w:t>5.3. Kommunikations- und Vertriebspolitik</w:t>
+        <w:tab/>
+        <w:t>8</w:t>
+      </w:r>
+    </w:p>
+    <w:p>
+      <w:pPr>
+        <w:tabs>
+          <w:tab w:pos="8901" w:val="right"/>
+        </w:tabs>
+        <w:spacing w:after="80" w:line="240" w:lineRule="auto"/>
+        <w:ind w:left="0"/>
+      </w:pPr>
+      <w:r>
+        <w:rPr>
+          <w:sz w:val="20"/>
+        </w:rPr>
+        <w:t>6. Unternehmen und Organisation</w:t>
+        <w:tab/>
+        <w:t>9</w:t>
+      </w:r>
+    </w:p>
+    <w:p>
+      <w:pPr>
+        <w:tabs>
+          <w:tab w:pos="8646" w:val="right"/>
+        </w:tabs>
+        <w:spacing w:after="80" w:line="240" w:lineRule="auto"/>
+        <w:ind w:left="255"/>
+      </w:pPr>
+      <w:r>
+        <w:rPr>
+          <w:sz w:val="20"/>
+        </w:rPr>
+        <w:t>6.1. Rechtsform und Eigentumsverhältnisse</w:t>
+        <w:tab/>
+        <w:t>9</w:t>
+      </w:r>
+    </w:p>
+    <w:p>
+      <w:pPr>
+        <w:tabs>
+          <w:tab w:pos="8646" w:val="right"/>
+        </w:tabs>
+        <w:spacing w:after="80" w:line="240" w:lineRule="auto"/>
+        <w:ind w:left="255"/>
+      </w:pPr>
+      <w:r>
+        <w:rPr>
+          <w:sz w:val="20"/>
+        </w:rPr>
+        <w:t>6.2. Organisation</w:t>
+        <w:tab/>
+        <w:t>9</w:t>
+      </w:r>
+    </w:p>
+    <w:p>
+      <w:pPr>
+        <w:tabs>
+          <w:tab w:pos="8646" w:val="right"/>
+        </w:tabs>
+        <w:spacing w:after="80" w:line="240" w:lineRule="auto"/>
+        <w:ind w:left="255"/>
+      </w:pPr>
+      <w:r>
+        <w:rPr>
+          <w:sz w:val="20"/>
+        </w:rPr>
+        <w:t>6.3. Personal</w:t>
+        <w:tab/>
+        <w:t>9</w:t>
+      </w:r>
+    </w:p>
+    <w:p>
+      <w:pPr>
+        <w:tabs>
+          <w:tab w:pos="8646" w:val="right"/>
+        </w:tabs>
+        <w:spacing w:after="80" w:line="240" w:lineRule="auto"/>
+        <w:ind w:left="255"/>
+      </w:pPr>
+      <w:r>
+        <w:rPr>
+          <w:sz w:val="20"/>
+        </w:rPr>
+        <w:t>6.4. Standort</w:t>
+        <w:tab/>
+        <w:t>9</w:t>
+      </w:r>
+    </w:p>
+    <w:p>
+      <w:pPr>
+        <w:tabs>
+          <w:tab w:pos="8901" w:val="right"/>
+        </w:tabs>
+        <w:spacing w:after="80" w:line="240" w:lineRule="auto"/>
+        <w:ind w:left="0"/>
+      </w:pPr>
+      <w:r>
+        <w:rPr>
+          <w:sz w:val="20"/>
+        </w:rPr>
+        <w:t>7. Finanzplanung und Finanzierung</w:t>
+        <w:tab/>
+        <w:t>10</w:t>
+      </w:r>
+    </w:p>
+    <w:p>
+      <w:pPr>
+        <w:pStyle w:val="berschrift1"/>
+        <w:pageBreakBefore/>
         <w:numPr>
           <w:numId w:val="0"/>
         </w:numPr>
         <w:spacing w:before="200" w:after="100"/>
       </w:pPr>
       <w:r>
-        <w:t>Wirtschaftliches Beispielszenario</w:t>
+        <w:t>1. Executive Summary</w:t>
+      </w:r>
+    </w:p>
+    <w:p>
+      <w:pPr>
+        <w:spacing w:after="100" w:line="252" w:lineRule="auto"/>
+      </w:pPr>
+      <w:r>
+        <w:t>Dr. Mahsa Motlagh plant den Aufbau einer forschungsbasierten Beratung für partizipative Zukunftsgestaltung und Transformation. Sie unterstützt Projekt- und Programmverantwortliche, deren Arbeit von Stakeholder-Zusammenarbeit, zukunftsgerichteten Entscheidungen und der Übersetzung komplexen Wissens in praktisches Handeln abhängt.</w:t>
+      </w:r>
+    </w:p>
+    <w:p>
+      <w:pPr>
+        <w:spacing w:after="100" w:line="252" w:lineRule="auto"/>
+      </w:pPr>
+      <w:r>
+        <w:t>Die Beratung verbindet drei Leistungen: Futures and Transformation Advisory, Participatory Lab and Experience Delivery sowie Capability Building and Method Transfer. Kunden können abgegrenzte Analyse- und Beratungsprojekte, vollständig organisierte Labs, längerfristige Kompetenzprogramme oder zeitlich begrenzte eingebettete Mandate beauftragen.</w:t>
+      </w:r>
+    </w:p>
+    <w:p>
+      <w:pPr>
+        <w:spacing w:after="100" w:line="252" w:lineRule="auto"/>
+      </w:pPr>
+      <w:r>
+        <w:t>Die Gründerin bringt eine Promotion in Governance und Sozioökonomie natürlicher Ressourcen sowie Erfahrung in Forschung, internationaler Beratung, partizipativen Methoden, Serious Games, Weiterbildung und Projektkoordination mit. Der Markteintritt konzentriert sich auf Hochschulen, Forschungsverbünde, öffentliche Einrichtungen und NGOs. Unternehmen mit entsprechendem Transformationsbedarf bilden eine ergänzende Zielgruppe.</w:t>
+      </w:r>
+    </w:p>
+    <w:p>
+      <w:pPr>
+        <w:spacing w:after="100" w:line="252" w:lineRule="auto"/>
+      </w:pPr>
+      <w:r>
+        <w:t>Der Aufbau erfolgt zunächst als personengeführte Beratung ohne angestelltes Personal. Leistungen werden remote, hybrid und vor Ort erbracht. Kooperationen werden projektbezogen eingesetzt. Standardisierte Toolkits, professionelle Trainingsprogramme und lizenzierte Ressourcen sind spätere Entwicklungsoptionen; daraus werden in der Basisplanung keine Umsätze angesetzt.</w:t>
       </w:r>
     </w:p>
     <w:tbl>
@@ -914,18 +1345,6 @@
     </w:p>
     <w:p>
       <w:pPr>
-        <w:pStyle w:val="berschrift2"/>
-        <w:numPr>
-          <w:numId w:val="0"/>
-        </w:numPr>
-        <w:spacing w:before="200" w:after="100"/>
-      </w:pPr>
-      <w:r>
-        <w:t>Voraussetzungen für die Einreichung</w:t>
-      </w:r>
-    </w:p>
-    <w:p>
-      <w:pPr>
         <w:spacing w:after="100" w:line="252" w:lineRule="auto"/>
       </w:pPr>
       <w:r>
@@ -942,31 +1361,41 @@
         <w:spacing w:before="200" w:after="100"/>
       </w:pPr>
       <w:r>
-        <w:t>Dienstleistung</w:t>
+        <w:t>2. Dienstleistung</w:t>
       </w:r>
     </w:p>
     <w:p>
       <w:pPr>
         <w:pStyle w:val="berschrift2"/>
+        <w:pageBreakBefore w:val="0"/>
         <w:numPr>
           <w:numId w:val="0"/>
         </w:numPr>
         <w:spacing w:before="200" w:after="100"/>
       </w:pPr>
       <w:r>
-        <w:t>Angebote</w:t>
+        <w:t>2.1. Angebote</w:t>
+      </w:r>
+    </w:p>
+    <w:p>
+      <w:pPr>
+        <w:spacing w:after="100" w:line="252" w:lineRule="auto"/>
+      </w:pPr>
+      <w:r>
+        <w:t>Das Angebot verbindet strategische Beratung, partizipative Umsetzung und Kompetenzaufbau. Die drei in der Positionierung beschriebenen Leistungsbereiche werden im Folgenden in die Angebotsstruktur der Vorlage eingeordnet.</w:t>
       </w:r>
     </w:p>
     <w:p>
       <w:pPr>
         <w:pStyle w:val="berschrift3"/>
+        <w:pageBreakBefore w:val="0"/>
         <w:numPr>
           <w:numId w:val="0"/>
         </w:numPr>
         <w:spacing w:before="200" w:after="100"/>
       </w:pPr>
       <w:r>
-        <w:t>1. Futures and Transformation Advisory</w:t>
+        <w:t>2.1.1. Futures and Transformation Advisory</w:t>
       </w:r>
     </w:p>
     <w:p>
@@ -987,14 +1416,23 @@
     </w:p>
     <w:p>
       <w:pPr>
+        <w:spacing w:after="100" w:line="252" w:lineRule="auto"/>
+      </w:pPr>
+      <w:r>
+        <w:t>Fest umrissene Projekte mit Meilensteinen; beauftragte Labs einschließlich Evaluation; mehrteilige Qualifizierungsprogramme; eingebettete Interim-Mandate mit klar begrenztem fachlichem Auftrag. Eine Übernahme von Linienführung wird nur angeboten, wenn sie tatsächlich vereinbart und fachlich gedeckt ist.</w:t>
+      </w:r>
+    </w:p>
+    <w:p>
+      <w:pPr>
         <w:pStyle w:val="berschrift3"/>
+        <w:pageBreakBefore w:val="0"/>
         <w:numPr>
           <w:numId w:val="0"/>
         </w:numPr>
         <w:spacing w:before="200" w:after="100"/>
       </w:pPr>
       <w:r>
-        <w:t>2. Participatory Lab and Experience Delivery</w:t>
+        <w:t>2.1.2. Participatory Lab and Experience Delivery</w:t>
       </w:r>
     </w:p>
     <w:p>
@@ -1016,13 +1454,14 @@
     <w:p>
       <w:pPr>
         <w:pStyle w:val="berschrift3"/>
+        <w:pageBreakBefore w:val="0"/>
         <w:numPr>
           <w:numId w:val="0"/>
         </w:numPr>
         <w:spacing w:before="200" w:after="100"/>
       </w:pPr>
       <w:r>
-        <w:t>3. Capability Building and Method Transfer</w:t>
+        <w:t>2.1.3. Capability Building and Method Transfer</w:t>
       </w:r>
     </w:p>
     <w:p>
@@ -1044,21 +1483,130 @@
     <w:p>
       <w:pPr>
         <w:pStyle w:val="berschrift2"/>
+        <w:pageBreakBefore w:val="0"/>
         <w:numPr>
           <w:numId w:val="0"/>
         </w:numPr>
         <w:spacing w:before="200" w:after="100"/>
       </w:pPr>
       <w:r>
-        <w:t>Beauftragungsmodelle</w:t>
-      </w:r>
-    </w:p>
-    <w:p>
-      <w:pPr>
+        <w:t>2.2. Kundennutzen</w:t>
+      </w:r>
+    </w:p>
+    <w:p>
+      <w:pPr>
+        <w:pStyle w:val="Listenabsatz"/>
         <w:spacing w:after="100" w:line="252" w:lineRule="auto"/>
       </w:pPr>
       <w:r>
-        <w:t>Fest umrissene Projekte mit Meilensteinen; beauftragte Labs einschließlich Evaluation; mehrteilige Qualifizierungsprogramme; eingebettete Interim-Mandate mit klar begrenztem fachlichem Auftrag. Eine Übernahme von Linienführung wird nur angeboten, wenn sie tatsächlich vereinbart und fachlich gedeckt ist.</w:t>
+        <w:t>Bessere Entscheidungsgrundlagen: Forschung und unterschiedliche Wissensbestände werden in verständliche Optionen und Handlungswege übersetzt.</w:t>
+      </w:r>
+    </w:p>
+    <w:p>
+      <w:pPr>
+        <w:pStyle w:val="Listenabsatz"/>
+        <w:spacing w:after="100" w:line="252" w:lineRule="auto"/>
+      </w:pPr>
+      <w:r>
+        <w:t>Strukturierte Zusammenarbeit: Beteiligungsziele, Rollen und Erwartungen werden geklärt; Zielkonflikte können sichtbar bearbeitet werden.</w:t>
+      </w:r>
+    </w:p>
+    <w:p>
+      <w:pPr>
+        <w:pStyle w:val="Listenabsatz"/>
+        <w:spacing w:after="100" w:line="252" w:lineRule="auto"/>
+      </w:pPr>
+      <w:r>
+        <w:t>Erfahrbares Lernen: Serious Games und Simulationen machen Zusammenhänge, Unsicherheit und Konsequenzen von Entscheidungen diskutierbar.</w:t>
+      </w:r>
+    </w:p>
+    <w:p>
+      <w:pPr>
+        <w:pStyle w:val="Listenabsatz"/>
+        <w:spacing w:after="100" w:line="252" w:lineRule="auto"/>
+      </w:pPr>
+      <w:r>
+        <w:t>Umsetzbarer Transfer: Ergebnisse werden dokumentiert und in Verantwortlichkeiten, Pilotvorhaben und nächste Schritte überführt.</w:t>
+      </w:r>
+    </w:p>
+    <w:p>
+      <w:pPr>
+        <w:pStyle w:val="Listenabsatz"/>
+        <w:spacing w:after="100" w:line="252" w:lineRule="auto"/>
+      </w:pPr>
+      <w:r>
+        <w:t>Interne Handlungsfähigkeit: Teams erhalten Methoden und Materialien, die sie nach dem Mandat weiter nutzen können.</w:t>
+      </w:r>
+    </w:p>
+    <w:p>
+      <w:pPr>
+        <w:pStyle w:val="berschrift2"/>
+        <w:pageBreakBefore w:val="0"/>
+        <w:numPr>
+          <w:numId w:val="0"/>
+        </w:numPr>
+        <w:spacing w:before="200" w:after="100"/>
+      </w:pPr>
+      <w:r>
+        <w:t>2.3. Zielgruppe</w:t>
+      </w:r>
+    </w:p>
+    <w:p>
+      <w:pPr>
+        <w:spacing w:after="100" w:line="252" w:lineRule="auto"/>
+      </w:pPr>
+      <w:r>
+        <w:t>Primär: Projekt- und Programmleitungen in Hochschulen, Forschungsverbünden, öffentlichen Einrichtungen und NGOs, die Beteiligung, transdisziplinäre Zusammenarbeit oder Kompetenzentwicklung organisieren. Ergänzend: Unternehmen mit nachhaltigkeitsbezogenen Transformationsvorhaben und hohem Abstimmungsbedarf. Die Auftragsentscheidung kann bei Instituts- und Bereichsleitungen, Konsortialkoordination, Weiterbildung oder Beschaffung liegen.</w:t>
+      </w:r>
+    </w:p>
+    <w:p>
+      <w:pPr>
+        <w:spacing w:after="100" w:line="252" w:lineRule="auto"/>
+      </w:pPr>
+      <w:r>
+        <w:t>Typische Auslöser sind ein neuer Förderantrag, ein bewilligtes Verbundprojekt, ein Konflikt zwischen Stakeholder-Perspektiven, ein anstehender Strategieprozess oder die Einführung eines neuen Lernformats. Die Beratung priorisiert klar finanzierte Aufgaben mit benannter Auftraggeberseite und realistischem Zugang zu Beteiligten.</w:t>
+      </w:r>
+    </w:p>
+    <w:p>
+      <w:pPr>
+        <w:pStyle w:val="berschrift2"/>
+        <w:pageBreakBefore w:val="0"/>
+        <w:numPr>
+          <w:numId w:val="0"/>
+        </w:numPr>
+        <w:spacing w:before="200" w:after="100"/>
+      </w:pPr>
+      <w:r>
+        <w:t>2.4. Alleinstellungsmerkmal</w:t>
+      </w:r>
+    </w:p>
+    <w:p>
+      <w:pPr>
+        <w:spacing w:after="100" w:line="252" w:lineRule="auto"/>
+      </w:pPr>
+      <w:r>
+        <w:t>Die Differenzierung liegt in der Verbindung wissenschaftlicher Methodenkompetenz, internationaler Stakeholder-Erfahrung und praktischer Formatentwicklung. Analyse, gemeinsames Erleben und Methodentransfer werden aus einer Hand angeboten. Dies ist ein Positionierungsansatz; eine rechtlich oder marktweit exklusive Alleinstellung wird nicht behauptet.</w:t>
+      </w:r>
+    </w:p>
+    <w:p>
+      <w:pPr>
+        <w:pStyle w:val="berschrift2"/>
+        <w:pageBreakBefore w:val="0"/>
+        <w:numPr>
+          <w:numId w:val="0"/>
+        </w:numPr>
+        <w:spacing w:before="200" w:after="100"/>
+      </w:pPr>
+      <w:r>
+        <w:t>2.5. Genehmigungen/Zulassungen</w:t>
+      </w:r>
+    </w:p>
+    <w:p>
+      <w:pPr>
+        <w:spacing w:after="100" w:line="252" w:lineRule="auto"/>
+      </w:pPr>
+      <w:r>
+        <w:t>Für die geplante allgemeine Beratungs- und Trainingsleistung wird derzeit keine besondere branchenspezifische Zulassung unterstellt. Die konkrete Tätigkeit und die Abgrenzung zu erlaubnispflichtigen Leistungen sind vor Aufnahme zu prüfen. Die steuerliche Einordnung als freiberuflich oder gewerblich ist mit Finanzamt bzw. Steuerberatung zu klären. Rechts-, Steuer- oder psychotherapeutische Beratung ist nicht Gegenstand des Angebots.</w:t>
       </w:r>
     </w:p>
     <w:p>
@@ -1071,165 +1619,15 @@
         <w:spacing w:before="200" w:after="100"/>
       </w:pPr>
       <w:r>
-        <w:t>Dienstleistung – Kundennutzen und Positionierung</w:t>
-      </w:r>
-    </w:p>
-    <w:p>
-      <w:pPr>
-        <w:pStyle w:val="berschrift2"/>
-        <w:numPr>
-          <w:numId w:val="0"/>
-        </w:numPr>
-        <w:spacing w:before="200" w:after="100"/>
-      </w:pPr>
-      <w:r>
-        <w:t>Kundennutzen</w:t>
-      </w:r>
-    </w:p>
-    <w:p>
-      <w:pPr>
-        <w:pStyle w:val="Listenabsatz"/>
+        <w:t>3. Gründerperson</w:t>
+      </w:r>
+    </w:p>
+    <w:p>
+      <w:pPr>
         <w:spacing w:after="100" w:line="252" w:lineRule="auto"/>
       </w:pPr>
       <w:r>
-        <w:t>Bessere Entscheidungsgrundlagen: Forschung und unterschiedliche Wissensbestände werden in verständliche Optionen und Handlungswege übersetzt.</w:t>
-      </w:r>
-    </w:p>
-    <w:p>
-      <w:pPr>
-        <w:pStyle w:val="Listenabsatz"/>
-        <w:spacing w:after="100" w:line="252" w:lineRule="auto"/>
-      </w:pPr>
-      <w:r>
-        <w:t>Strukturierte Zusammenarbeit: Beteiligungsziele, Rollen und Erwartungen werden geklärt; Zielkonflikte können sichtbar bearbeitet werden.</w:t>
-      </w:r>
-    </w:p>
-    <w:p>
-      <w:pPr>
-        <w:pStyle w:val="Listenabsatz"/>
-        <w:spacing w:after="100" w:line="252" w:lineRule="auto"/>
-      </w:pPr>
-      <w:r>
-        <w:t>Erfahrbares Lernen: Serious Games und Simulationen machen Zusammenhänge, Unsicherheit und Konsequenzen von Entscheidungen diskutierbar.</w:t>
-      </w:r>
-    </w:p>
-    <w:p>
-      <w:pPr>
-        <w:pStyle w:val="Listenabsatz"/>
-        <w:spacing w:after="100" w:line="252" w:lineRule="auto"/>
-      </w:pPr>
-      <w:r>
-        <w:t>Umsetzbarer Transfer: Ergebnisse werden dokumentiert und in Verantwortlichkeiten, Pilotvorhaben und nächste Schritte überführt.</w:t>
-      </w:r>
-    </w:p>
-    <w:p>
-      <w:pPr>
-        <w:pStyle w:val="Listenabsatz"/>
-        <w:spacing w:after="100" w:line="252" w:lineRule="auto"/>
-      </w:pPr>
-      <w:r>
-        <w:t>Interne Handlungsfähigkeit: Teams erhalten Methoden und Materialien, die sie nach dem Mandat weiter nutzen können.</w:t>
-      </w:r>
-    </w:p>
-    <w:p>
-      <w:pPr>
-        <w:pStyle w:val="berschrift2"/>
-        <w:numPr>
-          <w:numId w:val="0"/>
-        </w:numPr>
-        <w:spacing w:before="200" w:after="100"/>
-      </w:pPr>
-      <w:r>
-        <w:t>Zielgruppe</w:t>
-      </w:r>
-    </w:p>
-    <w:p>
-      <w:pPr>
-        <w:spacing w:after="100" w:line="252" w:lineRule="auto"/>
-      </w:pPr>
-      <w:r>
-        <w:t>Primär: Projekt- und Programmleitungen in Hochschulen, Forschungsverbünden, öffentlichen Einrichtungen und NGOs, die Beteiligung, transdisziplinäre Zusammenarbeit oder Kompetenzentwicklung organisieren. Ergänzend: Unternehmen mit nachhaltigkeitsbezogenen Transformationsvorhaben und hohem Abstimmungsbedarf. Die Auftragsentscheidung kann bei Instituts- und Bereichsleitungen, Konsortialkoordination, Weiterbildung oder Beschaffung liegen.</w:t>
-      </w:r>
-    </w:p>
-    <w:p>
-      <w:pPr>
-        <w:spacing w:after="100" w:line="252" w:lineRule="auto"/>
-      </w:pPr>
-      <w:r>
-        <w:t>Typische Auslöser sind ein neuer Förderantrag, ein bewilligtes Verbundprojekt, ein Konflikt zwischen Stakeholder-Perspektiven, ein anstehender Strategieprozess oder die Einführung eines neuen Lernformats. Die Beratung priorisiert klar finanzierte Aufgaben mit benannter Auftraggeberseite und realistischem Zugang zu Beteiligten.</w:t>
-      </w:r>
-    </w:p>
-    <w:p>
-      <w:pPr>
-        <w:pStyle w:val="berschrift2"/>
-        <w:numPr>
-          <w:numId w:val="0"/>
-        </w:numPr>
-        <w:spacing w:before="200" w:after="100"/>
-      </w:pPr>
-      <w:r>
-        <w:t>Alleinstellungsmerkmal</w:t>
-      </w:r>
-    </w:p>
-    <w:p>
-      <w:pPr>
-        <w:spacing w:after="100" w:line="252" w:lineRule="auto"/>
-      </w:pPr>
-      <w:r>
-        <w:t>Die Differenzierung liegt in der Verbindung wissenschaftlicher Methodenkompetenz, internationaler Stakeholder-Erfahrung und praktischer Formatentwicklung. Analyse, gemeinsames Erleben und Methodentransfer werden aus einer Hand angeboten. Dies ist ein Positionierungsansatz; eine rechtlich oder marktweit exklusive Alleinstellung wird nicht behauptet.</w:t>
-      </w:r>
-    </w:p>
-    <w:p>
-      <w:pPr>
-        <w:pStyle w:val="berschrift2"/>
-        <w:numPr>
-          <w:numId w:val="0"/>
-        </w:numPr>
-        <w:spacing w:before="200" w:after="100"/>
-      </w:pPr>
-      <w:r>
-        <w:t>Genehmigungen/Zulassungen</w:t>
-      </w:r>
-    </w:p>
-    <w:p>
-      <w:pPr>
-        <w:spacing w:after="100" w:line="252" w:lineRule="auto"/>
-      </w:pPr>
-      <w:r>
-        <w:t>Für die geplante allgemeine Beratungs- und Trainingsleistung wird derzeit keine besondere branchenspezifische Zulassung unterstellt. Die konkrete Tätigkeit und die Abgrenzung zu erlaubnispflichtigen Leistungen sind vor Aufnahme zu prüfen. Die steuerliche Einordnung als freiberuflich oder gewerblich ist mit Finanzamt bzw. Steuerberatung zu klären. Rechts-, Steuer- oder psychotherapeutische Beratung ist nicht Gegenstand des Angebots.</w:t>
-      </w:r>
-    </w:p>
-    <w:p>
-      <w:pPr>
-        <w:pStyle w:val="berschrift1"/>
-        <w:pageBreakBefore/>
-        <w:numPr>
-          <w:numId w:val="0"/>
-        </w:numPr>
-        <w:spacing w:before="200" w:after="100"/>
-      </w:pPr>
-      <w:r>
-        <w:t>Gründerperson</w:t>
-      </w:r>
-    </w:p>
-    <w:p>
-      <w:pPr>
-        <w:spacing w:after="100" w:line="252" w:lineRule="auto"/>
-      </w:pPr>
-      <w:r>
         <w:t>Dr. Mahsa Motlagh verfügt über einen Dr. agr. der Universität Bonn (11/2012–01/2018), einen Masterabschluss in Agricultural Sciences &amp; Sustainable Resource Management (04/2009–09/2012) und einen Bachelorabschluss in Agricultural Economics &amp; Development der Universität Teheran (1999–2003).</w:t>
-      </w:r>
-    </w:p>
-    <w:p>
-      <w:pPr>
-        <w:pStyle w:val="berschrift2"/>
-        <w:numPr>
-          <w:numId w:val="0"/>
-        </w:numPr>
-        <w:spacing w:before="200" w:after="100"/>
-      </w:pPr>
-      <w:r>
-        <w:t>Relevante berufliche Erfahrung</w:t>
       </w:r>
     </w:p>
     <w:tbl>
@@ -1487,18 +1885,6 @@
     </w:p>
     <w:p>
       <w:pPr>
-        <w:pStyle w:val="berschrift2"/>
-        <w:numPr>
-          <w:numId w:val="0"/>
-        </w:numPr>
-        <w:spacing w:before="200" w:after="100"/>
-      </w:pPr>
-      <w:r>
-        <w:t>Fachliche und unternehmerische Eignung</w:t>
-      </w:r>
-    </w:p>
-    <w:p>
-      <w:pPr>
         <w:spacing w:after="100" w:line="252" w:lineRule="auto"/>
       </w:pPr>
       <w:r>
@@ -1531,19 +1917,20 @@
         <w:spacing w:before="200" w:after="100"/>
       </w:pPr>
       <w:r>
-        <w:t>Marktanalyse</w:t>
+        <w:t>4. Marktanalyse</w:t>
       </w:r>
     </w:p>
     <w:p>
       <w:pPr>
         <w:pStyle w:val="berschrift2"/>
+        <w:pageBreakBefore w:val="0"/>
         <w:numPr>
           <w:numId w:val="0"/>
         </w:numPr>
         <w:spacing w:before="200" w:after="100"/>
       </w:pPr>
       <w:r>
-        <w:t>Aktuelle Marktsituation/Trends</w:t>
+        <w:t>4.1. Aktuelle Marktsituation/Trends</w:t>
       </w:r>
     </w:p>
     <w:p>
@@ -1565,13 +1952,14 @@
     <w:p>
       <w:pPr>
         <w:pStyle w:val="berschrift2"/>
+        <w:pageBreakBefore w:val="0"/>
         <w:numPr>
           <w:numId w:val="0"/>
         </w:numPr>
         <w:spacing w:before="200" w:after="100"/>
       </w:pPr>
       <w:r>
-        <w:t>Wettbewerbsanalyse</w:t>
+        <w:t>4.2. Wettbewerbsanalyse</w:t>
       </w:r>
     </w:p>
     <w:tbl>
@@ -1877,13 +2265,14 @@
     <w:p>
       <w:pPr>
         <w:pStyle w:val="berschrift2"/>
+        <w:pageBreakBefore w:val="0"/>
         <w:numPr>
           <w:numId w:val="0"/>
         </w:numPr>
         <w:spacing w:before="200" w:after="100"/>
       </w:pPr>
       <w:r>
-        <w:t>Zielgruppenanalyse und eigenes Marktpotenzial</w:t>
+        <w:t>4.3. Zielgruppenanalyse</w:t>
       </w:r>
     </w:p>
     <w:p>
@@ -1892,6 +2281,19 @@
       </w:pPr>
       <w:r>
         <w:t>Für den Einstieg werden drei priorisierte Segmente bearbeitet: Forschungsverbünde mit Beteiligungsaufgaben; öffentliche und gemeinnützige Programmträger mit Transformationsfragen; Organisationen mit Bedarf an Methoden- und Facilitator-Entwicklung. Ein kleiner adressierbarer Kundenkreis mit konkretem Budget ist für die Einzelberatung wichtiger als eine unbelegte Gesamtmarktzahl.</w:t>
+      </w:r>
+    </w:p>
+    <w:p>
+      <w:pPr>
+        <w:pStyle w:val="berschrift2"/>
+        <w:pageBreakBefore w:val="0"/>
+        <w:numPr>
+          <w:numId w:val="0"/>
+        </w:numPr>
+        <w:spacing w:before="200" w:after="100"/>
+      </w:pPr>
+      <w:r>
+        <w:t>4.4. Einschätzung des eigenen Marktpotenzials</w:t>
       </w:r>
     </w:p>
     <w:p>
@@ -1912,19 +2314,20 @@
         <w:spacing w:before="200" w:after="100"/>
       </w:pPr>
       <w:r>
-        <w:t>Marketing</w:t>
+        <w:t>5. Marketing</w:t>
       </w:r>
     </w:p>
     <w:p>
       <w:pPr>
         <w:pStyle w:val="berschrift2"/>
+        <w:pageBreakBefore w:val="0"/>
         <w:numPr>
           <w:numId w:val="0"/>
         </w:numPr>
         <w:spacing w:before="200" w:after="100"/>
       </w:pPr>
       <w:r>
-        <w:t>Produktpolitik</w:t>
+        <w:t>5.1. Produktpolitik</w:t>
       </w:r>
     </w:p>
     <w:p>
@@ -1938,13 +2341,14 @@
     <w:p>
       <w:pPr>
         <w:pStyle w:val="berschrift2"/>
+        <w:pageBreakBefore w:val="0"/>
         <w:numPr>
           <w:numId w:val="0"/>
         </w:numPr>
         <w:spacing w:before="200" w:after="100"/>
       </w:pPr>
       <w:r>
-        <w:t>Preispolitik</w:t>
+        <w:t>5.2. Preispolitik</w:t>
       </w:r>
     </w:p>
     <w:p>
@@ -2258,13 +2662,14 @@
     <w:p>
       <w:pPr>
         <w:pStyle w:val="berschrift2"/>
+        <w:pageBreakBefore w:val="0"/>
         <w:numPr>
           <w:numId w:val="0"/>
         </w:numPr>
         <w:spacing w:before="200" w:after="100"/>
       </w:pPr>
       <w:r>
-        <w:t>Kommunikations- und Vertriebspolitik</w:t>
+        <w:t>5.3. Kommunikations- und Vertriebspolitik</w:t>
       </w:r>
     </w:p>
     <w:p>
@@ -2301,19 +2706,20 @@
         <w:spacing w:before="200" w:after="100"/>
       </w:pPr>
       <w:r>
-        <w:t>Unternehmen und Organisation</w:t>
+        <w:t>6. Unternehmen und Organisation</w:t>
       </w:r>
     </w:p>
     <w:p>
       <w:pPr>
         <w:pStyle w:val="berschrift2"/>
+        <w:pageBreakBefore w:val="0"/>
         <w:numPr>
           <w:numId w:val="0"/>
         </w:numPr>
         <w:spacing w:before="200" w:after="100"/>
       </w:pPr>
       <w:r>
-        <w:t>Rechtsform und Eigentumsverhältnisse</w:t>
+        <w:t>6.1. Rechtsform und Eigentumsverhältnisse</w:t>
       </w:r>
     </w:p>
     <w:p>
@@ -2327,13 +2733,14 @@
     <w:p>
       <w:pPr>
         <w:pStyle w:val="berschrift2"/>
+        <w:pageBreakBefore w:val="0"/>
         <w:numPr>
           <w:numId w:val="0"/>
         </w:numPr>
         <w:spacing w:before="200" w:after="100"/>
       </w:pPr>
       <w:r>
-        <w:t>Organisation</w:t>
+        <w:t>6.2. Organisation</w:t>
       </w:r>
     </w:p>
     <w:p>
@@ -2354,14 +2761,31 @@
     </w:p>
     <w:p>
       <w:pPr>
+        <w:spacing w:after="100" w:line="252" w:lineRule="auto"/>
+      </w:pPr>
+      <w:r>
+        <w:t>Verträge regeln Umfang, Abnahme, Honorar, Zahlungsziel, Stornierung, Vertraulichkeit, Haftung und Rechte an Materialien. Hintergrundmethoden und kundenspezifische Arbeitsergebnisse werden unterschieden. Bei eingebetteten Mandaten sind die tatsächliche selbstständige Ausgestaltung und eine mögliche Statusklärung zu beachten.</w:t>
+      </w:r>
+    </w:p>
+    <w:p>
+      <w:pPr>
+        <w:spacing w:after="100" w:line="252" w:lineRule="auto"/>
+      </w:pPr>
+      <w:r>
+        <w:t>Personenbezogene Forschungs-, Workshop- und Teilnehmerdaten werden zweckgebunden verarbeitet. Notwendig sind geeignete Datenschutzinformationen, Rechtsgrundlagen, gegebenenfalls Auftragsverarbeitungsverträge, Zugriffsschutz und Löschfristen. Eine Berufshaftpflicht bzw. Vermögensschadenhaftpflicht ist nach tatsächlichem Leistungsprofil zu prüfen. Qualität wird durch dokumentierte Auftragsziele, Pilotierung, Feedback und Ergebnisabgleich gesichert.</w:t>
+      </w:r>
+    </w:p>
+    <w:p>
+      <w:pPr>
         <w:pStyle w:val="berschrift2"/>
+        <w:pageBreakBefore w:val="0"/>
         <w:numPr>
           <w:numId w:val="0"/>
         </w:numPr>
         <w:spacing w:before="200" w:after="100"/>
       </w:pPr>
       <w:r>
-        <w:t>Personal</w:t>
+        <w:t>6.3. Personal</w:t>
       </w:r>
     </w:p>
     <w:p>
@@ -2375,13 +2799,14 @@
     <w:p>
       <w:pPr>
         <w:pStyle w:val="berschrift2"/>
+        <w:pageBreakBefore w:val="0"/>
         <w:numPr>
           <w:numId w:val="0"/>
         </w:numPr>
         <w:spacing w:before="200" w:after="100"/>
       </w:pPr>
       <w:r>
-        <w:t>Standort</w:t>
+        <w:t>6.4. Standort</w:t>
       </w:r>
     </w:p>
     <w:p>
@@ -2390,34 +2815,6 @@
       </w:pPr>
       <w:r>
         <w:t>Unternehmenssitz ist Stavenhagen; die genaue Geschäftsanschrift ist noch zu ergänzen. Geplant ist ein kostenschlanker digitaler Betrieb, nach Möglichkeit mit vorhandener Arbeitsinfrastruktur und ohne langfristige externe Büroanmietung. Der zulässige Nutzungsumfang ist standortabhängig zu prüfen. Termine finden remote oder in geeigneten Kunden- bzw. Veranstaltungsräumen statt.</w:t>
-      </w:r>
-    </w:p>
-    <w:p>
-      <w:pPr>
-        <w:pStyle w:val="berschrift2"/>
-        <w:numPr>
-          <w:numId w:val="0"/>
-        </w:numPr>
-        <w:spacing w:before="200" w:after="100"/>
-      </w:pPr>
-      <w:r>
-        <w:t>Verträge, Datenschutz und Qualität</w:t>
-      </w:r>
-    </w:p>
-    <w:p>
-      <w:pPr>
-        <w:spacing w:after="100" w:line="252" w:lineRule="auto"/>
-      </w:pPr>
-      <w:r>
-        <w:t>Verträge regeln Umfang, Abnahme, Honorar, Zahlungsziel, Stornierung, Vertraulichkeit, Haftung und Rechte an Materialien. Hintergrundmethoden und kundenspezifische Arbeitsergebnisse werden unterschieden. Bei eingebetteten Mandaten sind die tatsächliche selbstständige Ausgestaltung und eine mögliche Statusklärung zu beachten.</w:t>
-      </w:r>
-    </w:p>
-    <w:p>
-      <w:pPr>
-        <w:spacing w:after="100" w:line="252" w:lineRule="auto"/>
-      </w:pPr>
-      <w:r>
-        <w:t>Personenbezogene Forschungs-, Workshop- und Teilnehmerdaten werden zweckgebunden verarbeitet. Notwendig sind geeignete Datenschutzinformationen, Rechtsgrundlagen, gegebenenfalls Auftragsverarbeitungsverträge, Zugriffsschutz und Löschfristen. Eine Berufshaftpflicht bzw. Vermögensschadenhaftpflicht ist nach tatsächlichem Leistungsprofil zu prüfen. Qualität wird durch dokumentierte Auftragsziele, Pilotierung, Feedback und Ergebnisabgleich gesichert.</w:t>
       </w:r>
     </w:p>
     <w:p>
@@ -2430,7 +2827,7 @@
         <w:spacing w:before="200" w:after="100"/>
       </w:pPr>
       <w:r>
-        <w:t>Finanzplanung und Finanzierung</w:t>
+        <w:t>7. Finanzplanung und Finanzierung</w:t>
       </w:r>
     </w:p>
     <w:p>
@@ -2439,18 +2836,6 @@
       </w:pPr>
       <w:r>
         <w:t>Alle folgenden Zahlen sind ein eigenständig entwickeltes Beispielszenario. Sie ersetzen weder persönliche Budgetangaben noch Nachweise zu Eigenmitteln, Angebotspreisen oder Aufträgen. Betriebsjahr 1 läuft vom 09.12.2026 bis 08.12.2027, Jahr 2 vom 09.12.2027 bis 08.12.2028 und Jahr 3 vom 09.12.2028 bis 08.12.2029. Die Monatsplanung nutzt zwölf Betriebsmonate ab Gründung, keine Kalenderjahre.</w:t>
-      </w:r>
-    </w:p>
-    <w:p>
-      <w:pPr>
-        <w:pStyle w:val="berschrift2"/>
-        <w:numPr>
-          <w:numId w:val="0"/>
-        </w:numPr>
-        <w:spacing w:before="200" w:after="100"/>
-      </w:pPr>
-      <w:r>
-        <w:t>Umsatzplanung</w:t>
       </w:r>
     </w:p>
     <w:tbl>
@@ -2839,18 +3224,6 @@
         <w:t>Ein möglicher Auftragsmix im ersten Jahr wäre vier Advisory-Sprints à sechs Tage, drei Labs à acht Tage und drei Transferprogramme à sechs Tage. Das sind zehn projektbezogene Beauftragungen, nicht zwingend zehn unterschiedliche Kunden. Es bestehen dafür in dieser Planung keine bestätigten Buchungen. Jahr 2 und 3 setzen sowohl steigende Auslastung als auch einen auf 950 € bzw. 1.000 € steigenden durchschnittlichen Tagessatz voraus.</w:t>
       </w:r>
     </w:p>
-    <w:p>
-      <w:pPr>
-        <w:pStyle w:val="berschrift2"/>
-        <w:numPr>
-          <w:numId w:val="0"/>
-        </w:numPr>
-        <w:spacing w:before="200" w:after="100"/>
-      </w:pPr>
-      <w:r>
-        <w:t>Betriebliche Kosten</w:t>
-      </w:r>
-    </w:p>
     <w:tbl>
       <w:tblPr>
         <w:tblW w:type="auto" w:w="0"/>
@@ -3464,31 +3837,6 @@
         <w:t>Ergebnisübersicht: Jahr 1: 59.400 € Umsatz − 14.400 € Aufwendungen = 45.000 €. Jahr 2: 85.500 € − 18.000 € = 67.500 €. Jahr 3: 108.000 € − 21.600 € = 86.400 €. Alle Ergebnisse vor persönlichen Steuern; siehe auch die Tabelle im Executive Summary.</w:t>
       </w:r>
     </w:p>
-    <w:p>
-      <w:pPr>
-        <w:pStyle w:val="berschrift1"/>
-        <w:pageBreakBefore/>
-        <w:numPr>
-          <w:numId w:val="0"/>
-        </w:numPr>
-        <w:spacing w:before="200" w:after="100"/>
-      </w:pPr>
-      <w:r>
-        <w:t>Finanzierung und monatliche Liquidität</w:t>
-      </w:r>
-    </w:p>
-    <w:p>
-      <w:pPr>
-        <w:pStyle w:val="berschrift2"/>
-        <w:numPr>
-          <w:numId w:val="0"/>
-        </w:numPr>
-        <w:spacing w:before="200" w:after="100"/>
-      </w:pPr>
-      <w:r>
-        <w:t>Kapitalbedarf und Finanzierungsannahme</w:t>
-      </w:r>
-    </w:p>
     <w:tbl>
       <w:tblPr>
         <w:tblW w:type="auto" w:w="0"/>
@@ -3709,18 +4057,6 @@
       </w:pPr>
       <w:r>
         <w:t>Privater Bedarf: beispielhaft 1.800 € Lebenshaltung und 600 € persönliche Kranken-/Pflegeversicherung monatlich, zusammen 2.400 €. Der tatsächliche Bedarf kann deutlich abweichen. Steuerreserve: pauschal 25 % des kumulierten positiven Betriebsergebnisses, als gebundene Liquidität behandelt; keine individuelle Steuerberechnung. Vereinfachung: Rechnung und Zahlung erfolgen im selben Monat, Betriebsausgaben monatlich 1.200 €. Verzögerte Zahlungseingänge werden im Risikoszenario betrachtet.</w:t>
-      </w:r>
-    </w:p>
-    <w:p>
-      <w:pPr>
-        <w:pStyle w:val="berschrift2"/>
-        <w:numPr>
-          <w:numId w:val="0"/>
-        </w:numPr>
-        <w:spacing w:before="200" w:after="100"/>
-      </w:pPr>
-      <w:r>
-        <w:t>Jahr 1: verfügbare Liquidität nach Reserven</w:t>
       </w:r>
     </w:p>
     <w:tbl>
@@ -5139,31 +5475,6 @@
     </w:p>
     <w:p>
       <w:pPr>
-        <w:pStyle w:val="berschrift1"/>
-        <w:pageBreakBefore/>
-        <w:numPr>
-          <w:numId w:val="0"/>
-        </w:numPr>
-        <w:spacing w:before="200" w:after="100"/>
-      </w:pPr>
-      <w:r>
-        <w:t>Tragfähigkeit, Risiken und Umsetzung</w:t>
-      </w:r>
-    </w:p>
-    <w:p>
-      <w:pPr>
-        <w:pStyle w:val="berschrift2"/>
-        <w:numPr>
-          <w:numId w:val="0"/>
-        </w:numPr>
-        <w:spacing w:before="200" w:after="100"/>
-      </w:pPr>
-      <w:r>
-        <w:t>Tragfähigkeitslogik und Sensitivität</w:t>
-      </w:r>
-    </w:p>
-    <w:p>
-      <w:pPr>
         <w:spacing w:after="100" w:line="252" w:lineRule="auto"/>
       </w:pPr>
       <w:r>
@@ -5493,18 +5804,6 @@
     </w:p>
     <w:p>
       <w:pPr>
-        <w:pStyle w:val="berschrift2"/>
-        <w:numPr>
-          <w:numId w:val="0"/>
-        </w:numPr>
-        <w:spacing w:before="200" w:after="100"/>
-      </w:pPr>
-      <w:r>
-        <w:t>Wesentliche Risiken und Gegenmaßnahmen</w:t>
-      </w:r>
-    </w:p>
-    <w:p>
-      <w:pPr>
         <w:pStyle w:val="Listenabsatz"/>
         <w:spacing w:after="100" w:line="252" w:lineRule="auto"/>
       </w:pPr>
@@ -5550,47 +5849,10 @@
     </w:p>
     <w:p>
       <w:pPr>
-        <w:pStyle w:val="berschrift2"/>
-        <w:numPr>
-          <w:numId w:val="0"/>
-        </w:numPr>
-        <w:spacing w:before="200" w:after="100"/>
-      </w:pPr>
-      <w:r>
-        <w:t>Umsetzungsplan</w:t>
-      </w:r>
-    </w:p>
-    <w:p>
-      <w:pPr>
         <w:spacing w:after="100" w:line="252" w:lineRule="auto"/>
       </w:pPr>
       <w:r>
         <w:t>Vor dem geplanten Start am 09.12.2026 in Stavenhagen: Fördervoraussetzungen und Status klären; tatsächlichen Privatbedarf, Versicherungen und Eigenmittel nachweisen. Monat 1–2: Leistungsblätter, Vertragsgrundlagen, zehn Bedarfsgespräche und erste Angebote. Monat 3–6: erste bezahlte Piloten, Evaluation und Preisprüfung. Monat 7–12: wiederkehrende Auftraggeber, dokumentierte Transferangebote und monatlicher Soll-Ist-Abgleich. Standardisierung oder Lizenzierung erst nach validierter Nachfrage.</w:t>
-      </w:r>
-    </w:p>
-    <w:p>
-      <w:pPr>
-        <w:pStyle w:val="berschrift1"/>
-        <w:pageBreakBefore/>
-        <w:numPr>
-          <w:numId w:val="0"/>
-        </w:numPr>
-        <w:spacing w:before="200" w:after="100"/>
-      </w:pPr>
-      <w:r>
-        <w:t>Anlagen und offene Nachweise</w:t>
-      </w:r>
-    </w:p>
-    <w:p>
-      <w:pPr>
-        <w:pStyle w:val="berschrift2"/>
-        <w:numPr>
-          <w:numId w:val="0"/>
-        </w:numPr>
-        <w:spacing w:before="200" w:after="100"/>
-      </w:pPr>
-      <w:r>
-        <w:t>Für die finale Einreichung zu ergänzen</w:t>
       </w:r>
     </w:p>
     <w:p>
@@ -5663,18 +5925,6 @@
       </w:pPr>
       <w:r>
         <w:t>CV, Abschluss- und Weiterbildungsnachweise sowie freigegebene Arbeitsproben oder Referenzen.</w:t>
-      </w:r>
-    </w:p>
-    <w:p>
-      <w:pPr>
-        <w:pStyle w:val="berschrift2"/>
-        <w:numPr>
-          <w:numId w:val="0"/>
-        </w:numPr>
-        <w:spacing w:before="200" w:after="100"/>
-      </w:pPr>
-      <w:r>
-        <w:t>Grundlagen und Abgrenzung</w:t>
       </w:r>
     </w:p>
     <w:p>

</xml_diff>